<commit_message>
feat: placeholders Word Gavia y tooling migracion 040
Plantillas OC/anexos con campos docxtemplater. Script templates:gavia:placeholders. Bundle y npm run db:apply:040. Guardias copiar semana navega adelante. Expediente muestra nombre del desarrollo.

Co-authored-by: Cursor <cursoragent@cursor.com>
</commit_message>
<xml_diff>
--- a/public/documentos-templates/mision-la-gavia/anexo-a-datos.docx
+++ b/public/documentos-templates/mision-la-gavia/anexo-a-datos.docx
@@ -72,7 +72,7 @@
           <w:sz w:val="22"/>
           <w:szCs w:val="22"/>
         </w:rPr>
-        <w:t>3 de marzo 2026</w:t>
+        <w:t>{fecha_hoy}</w:t>
       </w:r>
     </w:p>
     <w:p>
@@ -183,7 +183,7 @@
           <w:sz w:val="21"/>
           <w:szCs w:val="21"/>
         </w:rPr>
-        <w:t>ANA GUADALUPE ESCOBAR MIRABENT</w:t>
+        <w:t>{cliente_nombre}</w:t>
       </w:r>
       <w:r>
         <w:rPr>
@@ -2722,7 +2722,7 @@
           <w:szCs w:val="21"/>
           <w:u w:val="single"/>
         </w:rPr>
-        <w:t>ANA GUADALUPE ESCOBAR MIRABENT</w:t>
+        <w:t>{cliente_nombre}</w:t>
       </w:r>
     </w:p>
     <w:sectPr>

</xml_diff>

<commit_message>
feat: oferta Gavia auto-llenada, plantillas admin y carpetas Drive por unidad
Genera pack de oferta/anexos con KYC y plan de pagos; sube plantillas sin redeploy; guarda expedientes en 3. Expediente Clientes como unidad + cliente.

Co-authored-by: Cursor <cursoragent@cursor.com>
</commit_message>
<xml_diff>
--- a/public/documentos-templates/mision-la-gavia/anexo-a-datos.docx
+++ b/public/documentos-templates/mision-la-gavia/anexo-a-datos.docx
@@ -73,6 +73,9 @@
           <w:szCs w:val="22"/>
         </w:rPr>
         <w:t>{fecha_hoy}</w:t>
+        <w:t xml:space="preserve"/>
+        <w:t/>
+        <w:t xml:space="preserve"/>
       </w:r>
     </w:p>
     <w:p>
@@ -188,71 +191,6 @@
       <w:r>
         <w:rPr>
           <w:rFonts w:asciiTheme="majorHAnsi" w:hAnsiTheme="majorHAnsi" w:cstheme="majorHAnsi"/>
-          <w:i/>
-          <w:sz w:val="21"/>
-          <w:szCs w:val="21"/>
-        </w:rPr>
-        <w:t xml:space="preserve"> </w:t>
-      </w:r>
-      <w:r>
-        <w:rPr>
-          <w:rFonts w:asciiTheme="majorHAnsi" w:hAnsiTheme="majorHAnsi" w:cstheme="majorHAnsi"/>
-          <w:sz w:val="21"/>
-          <w:szCs w:val="21"/>
-        </w:rPr>
-        <w:t>quien me i</w:t>
-      </w:r>
-      <w:r>
-        <w:rPr>
-          <w:rFonts w:asciiTheme="majorHAnsi" w:hAnsiTheme="majorHAnsi" w:cstheme="majorHAnsi"/>
-          <w:sz w:val="21"/>
-          <w:szCs w:val="21"/>
-        </w:rPr>
-        <w:t>dentifico ante ustedes mediante identificación oficial</w:t>
-      </w:r>
-      <w:r>
-        <w:rPr>
-          <w:rFonts w:asciiTheme="majorHAnsi" w:hAnsiTheme="majorHAnsi" w:cstheme="majorHAnsi"/>
-          <w:sz w:val="21"/>
-          <w:szCs w:val="21"/>
-        </w:rPr>
-        <w:t xml:space="preserve"> </w:t>
-      </w:r>
-      <w:r>
-        <w:rPr>
-          <w:rFonts w:asciiTheme="majorHAnsi" w:hAnsiTheme="majorHAnsi" w:cstheme="majorHAnsi"/>
-          <w:sz w:val="21"/>
-          <w:szCs w:val="21"/>
-        </w:rPr>
-        <w:t>______</w:t>
-      </w:r>
-      <w:r>
-        <w:rPr>
-          <w:rFonts w:asciiTheme="majorHAnsi" w:hAnsiTheme="majorHAnsi" w:cstheme="majorHAnsi"/>
-          <w:sz w:val="21"/>
-          <w:szCs w:val="21"/>
-        </w:rPr>
-        <w:t>_________</w:t>
-      </w:r>
-      <w:r>
-        <w:rPr>
-          <w:rFonts w:asciiTheme="majorHAnsi" w:hAnsiTheme="majorHAnsi" w:cstheme="majorHAnsi"/>
-          <w:sz w:val="21"/>
-          <w:szCs w:val="21"/>
-        </w:rPr>
-        <w:t>_______</w:t>
-      </w:r>
-      <w:r>
-        <w:rPr>
-          <w:rFonts w:asciiTheme="majorHAnsi" w:hAnsiTheme="majorHAnsi" w:cstheme="majorHAnsi"/>
-          <w:sz w:val="21"/>
-          <w:szCs w:val="21"/>
-        </w:rPr>
-        <w:t>___</w:t>
-      </w:r>
-      <w:r>
-        <w:rPr>
-          <w:rFonts w:asciiTheme="majorHAnsi" w:hAnsiTheme="majorHAnsi" w:cstheme="majorHAnsi"/>
           <w:b/>
           <w:bCs/>
           <w:i/>
@@ -267,31 +205,28 @@
           <w:sz w:val="21"/>
           <w:szCs w:val="21"/>
         </w:rPr>
-        <w:t xml:space="preserve">número </w:t>
-      </w:r>
-      <w:r>
-        <w:rPr>
-          <w:rFonts w:asciiTheme="majorHAnsi" w:hAnsiTheme="majorHAnsi" w:cstheme="majorHAnsi"/>
-          <w:sz w:val="21"/>
-          <w:szCs w:val="21"/>
-        </w:rPr>
-        <w:t>_______</w:t>
-      </w:r>
-      <w:r>
-        <w:rPr>
-          <w:rFonts w:asciiTheme="majorHAnsi" w:hAnsiTheme="majorHAnsi" w:cstheme="majorHAnsi"/>
-          <w:sz w:val="21"/>
-          <w:szCs w:val="21"/>
-        </w:rPr>
-        <w:t>____________</w:t>
-      </w:r>
-      <w:r>
-        <w:rPr>
-          <w:rFonts w:asciiTheme="majorHAnsi" w:hAnsiTheme="majorHAnsi" w:cstheme="majorHAnsi"/>
-          <w:sz w:val="21"/>
-          <w:szCs w:val="21"/>
-        </w:rPr>
-        <w:t>_______________</w:t>
+        <w:t>quien me i</w:t>
+      </w:r>
+      <w:r>
+        <w:rPr>
+          <w:rFonts w:asciiTheme="majorHAnsi" w:hAnsiTheme="majorHAnsi" w:cstheme="majorHAnsi"/>
+          <w:sz w:val="21"/>
+          <w:szCs w:val="21"/>
+        </w:rPr>
+        <w:t>dentifico ante ustedes mediante identificación oficial {identificacion_tipo} número</w:t>
+        <w:t xml:space="preserve"/>
+        <w:t/>
+        <w:t xml:space="preserve"/>
+        <w:t xml:space="preserve"> </w:t>
+      </w:r>
+      <w:r>
+        <w:rPr>
+          <w:rFonts w:asciiTheme="majorHAnsi" w:hAnsiTheme="majorHAnsi" w:cstheme="majorHAnsi"/>
+          <w:sz w:val="21"/>
+          <w:szCs w:val="21"/>
+        </w:rPr>
+        <w:t>{identificacion_numero}</w:t>
+        <w:t/>
       </w:r>
       <w:r>
         <w:rPr>
@@ -475,6 +410,14 @@
                 <w:szCs w:val="21"/>
               </w:rPr>
             </w:pPr>
+            <w:r>
+              <w:rPr>
+                <w:rFonts w:asciiTheme="majorHAnsi" w:hAnsiTheme="majorHAnsi" w:cstheme="majorHAnsi"/>
+                <w:sz w:val="21"/>
+                <w:szCs w:val="21"/>
+              </w:rPr>
+              <w:t>{cliente_nombre}</w:t>
+            </w:r>
           </w:p>
         </w:tc>
       </w:tr>
@@ -524,6 +467,16 @@
                 <w:szCs w:val="21"/>
               </w:rPr>
             </w:pPr>
+            <w:r>
+              <w:rPr>
+                <w:rFonts w:asciiTheme="majorHAnsi" w:hAnsiTheme="majorHAnsi" w:cstheme="majorHAnsi"/>
+                <w:sz w:val="21"/>
+                <w:szCs w:val="21"/>
+              </w:rPr>
+              <w:t>{fecha_nacimiento}</w:t>
+              <w:t xml:space="preserve"/>
+              <w:t/>
+            </w:r>
           </w:p>
         </w:tc>
       </w:tr>
@@ -570,6 +523,14 @@
                 <w:szCs w:val="21"/>
               </w:rPr>
             </w:pPr>
+            <w:r>
+              <w:rPr>
+                <w:rFonts w:asciiTheme="majorHAnsi" w:hAnsiTheme="majorHAnsi" w:cstheme="majorHAnsi"/>
+                <w:sz w:val="21"/>
+                <w:szCs w:val="21"/>
+              </w:rPr>
+              <w:t>{lugar_nacimiento}</w:t>
+            </w:r>
           </w:p>
         </w:tc>
       </w:tr>
@@ -616,6 +577,14 @@
                 <w:szCs w:val="21"/>
               </w:rPr>
             </w:pPr>
+            <w:r>
+              <w:rPr>
+                <w:rFonts w:asciiTheme="majorHAnsi" w:hAnsiTheme="majorHAnsi" w:cstheme="majorHAnsi"/>
+                <w:sz w:val="21"/>
+                <w:szCs w:val="21"/>
+              </w:rPr>
+              <w:t>{nacionalidad}</w:t>
+            </w:r>
           </w:p>
         </w:tc>
       </w:tr>
@@ -678,6 +647,14 @@
                 <w:szCs w:val="21"/>
               </w:rPr>
             </w:pPr>
+            <w:r>
+              <w:rPr>
+                <w:rFonts w:asciiTheme="majorHAnsi" w:hAnsiTheme="majorHAnsi" w:cstheme="majorHAnsi"/>
+                <w:sz w:val="21"/>
+                <w:szCs w:val="21"/>
+              </w:rPr>
+              <w:t>{estado_civil}</w:t>
+            </w:r>
           </w:p>
         </w:tc>
       </w:tr>
@@ -724,6 +701,14 @@
                 <w:szCs w:val="21"/>
               </w:rPr>
             </w:pPr>
+            <w:r>
+              <w:rPr>
+                <w:rFonts w:asciiTheme="majorHAnsi" w:hAnsiTheme="majorHAnsi" w:cstheme="majorHAnsi"/>
+                <w:sz w:val="21"/>
+                <w:szCs w:val="21"/>
+              </w:rPr>
+              <w:t>{curp}</w:t>
+            </w:r>
           </w:p>
         </w:tc>
       </w:tr>
@@ -770,6 +755,14 @@
                 <w:szCs w:val="21"/>
               </w:rPr>
             </w:pPr>
+            <w:r>
+              <w:rPr>
+                <w:rFonts w:asciiTheme="majorHAnsi" w:hAnsiTheme="majorHAnsi" w:cstheme="majorHAnsi"/>
+                <w:sz w:val="21"/>
+                <w:szCs w:val="21"/>
+              </w:rPr>
+              <w:t>{rfc}</w:t>
+            </w:r>
           </w:p>
         </w:tc>
       </w:tr>
@@ -816,6 +809,14 @@
                 <w:szCs w:val="21"/>
               </w:rPr>
             </w:pPr>
+            <w:r>
+              <w:rPr>
+                <w:rFonts w:asciiTheme="majorHAnsi" w:hAnsiTheme="majorHAnsi" w:cstheme="majorHAnsi"/>
+                <w:sz w:val="21"/>
+                <w:szCs w:val="21"/>
+              </w:rPr>
+              <w:t>{domicilio}</w:t>
+            </w:r>
           </w:p>
         </w:tc>
       </w:tr>
@@ -862,6 +863,14 @@
                 <w:szCs w:val="21"/>
               </w:rPr>
             </w:pPr>
+            <w:r>
+              <w:rPr>
+                <w:rFonts w:asciiTheme="majorHAnsi" w:hAnsiTheme="majorHAnsi" w:cstheme="majorHAnsi"/>
+                <w:sz w:val="21"/>
+                <w:szCs w:val="21"/>
+              </w:rPr>
+              <w:t>{ocupacion}</w:t>
+            </w:r>
           </w:p>
         </w:tc>
       </w:tr>
@@ -978,6 +987,15 @@
                 <w:szCs w:val="21"/>
               </w:rPr>
             </w:pPr>
+            <w:r>
+              <w:rPr>
+                <w:rFonts w:asciiTheme="majorHAnsi" w:hAnsiTheme="majorHAnsi" w:cstheme="majorHAnsi"/>
+                <w:sz w:val="21"/>
+                <w:szCs w:val="21"/>
+              </w:rPr>
+              <w:t xml:space="preserve">{telefono}</w:t>
+              <w:t/>
+            </w:r>
           </w:p>
         </w:tc>
       </w:tr>
@@ -1024,6 +1042,14 @@
                 <w:szCs w:val="21"/>
               </w:rPr>
             </w:pPr>
+            <w:r>
+              <w:rPr>
+                <w:rFonts w:asciiTheme="majorHAnsi" w:hAnsiTheme="majorHAnsi" w:cstheme="majorHAnsi"/>
+                <w:sz w:val="21"/>
+                <w:szCs w:val="21"/>
+              </w:rPr>
+              <w:t>{email}</w:t>
+            </w:r>
           </w:p>
         </w:tc>
       </w:tr>
@@ -1617,7 +1643,6 @@
                 <w:sz w:val="21"/>
                 <w:szCs w:val="21"/>
               </w:rPr>
-              <w:lastRenderedPageBreak/>
               <w:t>Persona Moral</w:t>
             </w:r>
           </w:p>
@@ -2074,6 +2099,18 @@
                 <w:szCs w:val="21"/>
               </w:rPr>
             </w:pPr>
+            <w:r>
+              <w:rPr>
+                <w:rFonts w:asciiTheme="majorHAnsi" w:hAnsiTheme="majorHAnsi" w:cstheme="majorHAnsi"/>
+                <w:sz w:val="21"/>
+                <w:szCs w:val="21"/>
+              </w:rPr>
+              <w:t xml:space="preserve">{ubicacion_unidad}</w:t>
+              <w:t/>
+              <w:t xml:space="preserve"/>
+              <w:t/>
+              <w:t/>
+            </w:r>
           </w:p>
         </w:tc>
       </w:tr>
@@ -2193,7 +2230,7 @@
                 <w:shd w:val="clear" w:color="auto" w:fill="FFFFFF"/>
                 <w:lang w:val="es-ES"/>
               </w:rPr>
-              <w:t> </w:t>
+              <w:t>{precio_venta} ({precio_venta_letra})</w:t>
             </w:r>
           </w:p>
         </w:tc>
@@ -2241,6 +2278,15 @@
                 <w:szCs w:val="21"/>
               </w:rPr>
             </w:pPr>
+            <w:r>
+              <w:rPr>
+                <w:rFonts w:asciiTheme="majorHAnsi" w:hAnsiTheme="majorHAnsi" w:cstheme="majorHAnsi"/>
+                <w:sz w:val="21"/>
+                <w:szCs w:val="21"/>
+              </w:rPr>
+              <w:t xml:space="preserve">{tipo_operacion}</w:t>
+              <w:t/>
+            </w:r>
           </w:p>
         </w:tc>
       </w:tr>
@@ -2696,15 +2742,6 @@
         </w:rPr>
         <w:t>Nombre y Firma</w:t>
       </w:r>
-      <w:r>
-        <w:rPr>
-          <w:rFonts w:asciiTheme="majorHAnsi" w:hAnsiTheme="majorHAnsi" w:cstheme="majorHAnsi"/>
-          <w:color w:val="F2F2F2" w:themeColor="background1" w:themeShade="F2"/>
-          <w:sz w:val="21"/>
-          <w:szCs w:val="21"/>
-        </w:rPr>
-        <w:tab/>
-      </w:r>
     </w:p>
     <w:p>
       <w:pPr>
@@ -2712,15 +2749,13 @@
           <w:rFonts w:asciiTheme="majorHAnsi" w:hAnsiTheme="majorHAnsi" w:cstheme="majorHAnsi"/>
           <w:sz w:val="21"/>
           <w:szCs w:val="21"/>
-          <w:u w:val="single"/>
-        </w:rPr>
-      </w:pPr>
-      <w:r>
-        <w:rPr>
-          <w:rFonts w:asciiTheme="majorHAnsi" w:hAnsiTheme="majorHAnsi" w:cstheme="majorHAnsi"/>
-          <w:sz w:val="21"/>
-          <w:szCs w:val="21"/>
-          <w:u w:val="single"/>
+        </w:rPr>
+      </w:pPr>
+      <w:r>
+        <w:rPr>
+          <w:rFonts w:asciiTheme="majorHAnsi" w:hAnsiTheme="majorHAnsi" w:cstheme="majorHAnsi"/>
+          <w:sz w:val="21"/>
+          <w:szCs w:val="21"/>
         </w:rPr>
         <w:t>{cliente_nombre}</w:t>
       </w:r>
@@ -4299,7 +4334,6 @@
     <w:sig w:usb0="E00006FF" w:usb1="420024FF" w:usb2="02000000" w:usb3="00000000" w:csb0="0000019F" w:csb1="00000000"/>
   </w:font>
   <w:font w:name="MS Mincho">
-    <w:altName w:val="ＭＳ 明朝"/>
     <w:panose1 w:val="02020609040205080304"/>
     <w:charset w:val="80"/>
     <w:family w:val="modern"/>
@@ -4322,6 +4356,7 @@
     <w:sig w:usb0="E00002FF" w:usb1="6AC7FDFB" w:usb2="08000012" w:usb3="00000000" w:csb0="0002009F" w:csb1="00000000"/>
   </w:font>
   <w:font w:name="Lucida Grande">
+    <w:altName w:val="Segoe UI"/>
     <w:charset w:val="00"/>
     <w:family w:val="swiss"/>
     <w:pitch w:val="variable"/>
@@ -4343,7 +4378,6 @@
     <w:sig w:usb0="00000007" w:usb1="00000000" w:usb2="00000000" w:usb3="00000000" w:csb0="00000093" w:csb1="00000000"/>
   </w:font>
   <w:font w:name="Georgia">
-    <w:altName w:val="Georgia"/>
     <w:panose1 w:val="02040502050405020303"/>
     <w:charset w:val="00"/>
     <w:family w:val="roman"/>
@@ -4396,23 +4430,28 @@
     <w:rsid w:val="0007787D"/>
     <w:rsid w:val="00123571"/>
     <w:rsid w:val="00186467"/>
+    <w:rsid w:val="00220113"/>
     <w:rsid w:val="00227D5E"/>
     <w:rsid w:val="00344F63"/>
     <w:rsid w:val="00365B7E"/>
+    <w:rsid w:val="003973FF"/>
     <w:rsid w:val="003A6F1C"/>
     <w:rsid w:val="003B4362"/>
     <w:rsid w:val="004322ED"/>
     <w:rsid w:val="00434AC1"/>
     <w:rsid w:val="00437BDE"/>
+    <w:rsid w:val="00457B92"/>
     <w:rsid w:val="00484038"/>
     <w:rsid w:val="004B72D9"/>
     <w:rsid w:val="004D777C"/>
+    <w:rsid w:val="00537F9C"/>
     <w:rsid w:val="0056384D"/>
     <w:rsid w:val="00566431"/>
     <w:rsid w:val="00571469"/>
     <w:rsid w:val="0057173A"/>
     <w:rsid w:val="00574BAA"/>
     <w:rsid w:val="00595256"/>
+    <w:rsid w:val="005B4078"/>
     <w:rsid w:val="005F0C4E"/>
     <w:rsid w:val="00647E5E"/>
     <w:rsid w:val="00692E9B"/>
@@ -4424,8 +4463,10 @@
     <w:rsid w:val="0088178B"/>
     <w:rsid w:val="0089275A"/>
     <w:rsid w:val="008D3BA9"/>
+    <w:rsid w:val="00941EFC"/>
     <w:rsid w:val="00971836"/>
     <w:rsid w:val="00A15E00"/>
+    <w:rsid w:val="00BF58DA"/>
     <w:rsid w:val="00C1323C"/>
     <w:rsid w:val="00C34D79"/>
     <w:rsid w:val="00C97883"/>
@@ -4433,10 +4474,13 @@
     <w:rsid w:val="00D20085"/>
     <w:rsid w:val="00D522DD"/>
     <w:rsid w:val="00DD41CF"/>
+    <w:rsid w:val="00DD78F5"/>
     <w:rsid w:val="00E33E9A"/>
+    <w:rsid w:val="00E7551F"/>
     <w:rsid w:val="00EA248B"/>
     <w:rsid w:val="00EF1979"/>
     <w:rsid w:val="00F16244"/>
+    <w:rsid w:val="00F61EEE"/>
     <w:rsid w:val="00F6728E"/>
   </w:rsids>
   <m:mathPr>

</xml_diff>